<commit_message>
Documentation branch switch, for new head pointer
</commit_message>
<xml_diff>
--- a/Report/Iteration_1/BIT216-Assignment2-Iteration-1(Test_plan_and_Documentation).docx
+++ b/Report/Iteration_1/BIT216-Assignment2-Iteration-1(Test_plan_and_Documentation).docx
@@ -43,7 +43,7 @@
           <w:sz w:val="72"/>
           <w:szCs w:val="72"/>
         </w:rPr>
-        <w:t>SavePlate</w:t>
+        <w:t>ZeroWaste</w:t>
       </w:r>
     </w:p>
     <w:p>
@@ -298,7 +298,7 @@
                 <w:rFonts w:cs="Calibri"/>
                 <w:color w:val="000000" w:themeColor="text1"/>
               </w:rPr>
-              <w:t>SavePlate</w:t>
+              <w:t>ZeroWaste</w:t>
             </w:r>
           </w:p>
         </w:tc>
@@ -508,7 +508,21 @@
                 <w:rFonts w:cs="Calibri"/>
                 <w:color w:val="000000" w:themeColor="text1"/>
               </w:rPr>
-              <w:t>UC1 to UC6 (All Use Cases)</w:t>
+              <w:t>UC1 to UC</w:t>
+            </w:r>
+            <w:r>
+              <w:rPr>
+                <w:rFonts w:cs="Calibri"/>
+                <w:color w:val="000000" w:themeColor="text1"/>
+              </w:rPr>
+              <w:t>3</w:t>
+            </w:r>
+            <w:r>
+              <w:rPr>
+                <w:rFonts w:cs="Calibri"/>
+                <w:color w:val="000000" w:themeColor="text1"/>
+              </w:rPr>
+              <w:t xml:space="preserve"> (All Use Cases)</w:t>
             </w:r>
           </w:p>
         </w:tc>
@@ -1395,7 +1409,14 @@
                 <w:rFonts w:cs="Calibri"/>
                 <w:color w:val="000000" w:themeColor="text1"/>
               </w:rPr>
-              <w:t>Sprint 2</w:t>
+              <w:t xml:space="preserve">Sprint </w:t>
+            </w:r>
+            <w:r>
+              <w:rPr>
+                <w:rFonts w:cs="Calibri"/>
+                <w:color w:val="000000" w:themeColor="text1"/>
+              </w:rPr>
+              <w:t>3</w:t>
             </w:r>
           </w:p>
         </w:tc>
@@ -1535,7 +1556,14 @@
                 <w:rFonts w:cs="Calibri"/>
                 <w:color w:val="000000" w:themeColor="text1"/>
               </w:rPr>
-              <w:t>Sprint 2</w:t>
+              <w:t xml:space="preserve">Sprint </w:t>
+            </w:r>
+            <w:r>
+              <w:rPr>
+                <w:rFonts w:cs="Calibri"/>
+                <w:color w:val="000000" w:themeColor="text1"/>
+              </w:rPr>
+              <w:t>3</w:t>
             </w:r>
           </w:p>
         </w:tc>
@@ -1675,7 +1703,14 @@
                 <w:rFonts w:cs="Calibri"/>
                 <w:color w:val="000000" w:themeColor="text1"/>
               </w:rPr>
-              <w:t>Sprint 3</w:t>
+              <w:t xml:space="preserve">Sprint </w:t>
+            </w:r>
+            <w:r>
+              <w:rPr>
+                <w:rFonts w:cs="Calibri"/>
+                <w:color w:val="000000" w:themeColor="text1"/>
+              </w:rPr>
+              <w:t>4</w:t>
             </w:r>
           </w:p>
         </w:tc>
@@ -2003,7 +2038,14 @@
                 <w:rFonts w:cs="Calibri"/>
                 <w:color w:val="000000" w:themeColor="text1"/>
               </w:rPr>
-              <w:t>Student 1 &amp; 2</w:t>
+              <w:t>Student 1</w:t>
+            </w:r>
+            <w:r>
+              <w:rPr>
+                <w:rFonts w:cs="Calibri"/>
+                <w:color w:val="000000" w:themeColor="text1"/>
+              </w:rPr>
+              <w:t>, 2 &amp; 3</w:t>
             </w:r>
           </w:p>
         </w:tc>
@@ -2273,7 +2315,14 @@
                 <w:rFonts w:cs="Calibri"/>
                 <w:color w:val="000000" w:themeColor="text1"/>
               </w:rPr>
-              <w:t>Student 3</w:t>
+              <w:t xml:space="preserve">Student </w:t>
+            </w:r>
+            <w:r>
+              <w:rPr>
+                <w:rFonts w:cs="Calibri"/>
+                <w:color w:val="000000" w:themeColor="text1"/>
+              </w:rPr>
+              <w:t>1,2,&amp; 3</w:t>
             </w:r>
           </w:p>
         </w:tc>

</xml_diff>

<commit_message>
Session ending and authentication error solved
</commit_message>
<xml_diff>
--- a/Report/Iteration_1/BIT216-Assignment2-Iteration-1(Test_plan_and_Documentation).docx
+++ b/Report/Iteration_1/BIT216-Assignment2-Iteration-1(Test_plan_and_Documentation).docx
@@ -34,6 +34,7 @@
           <w:color w:val="000000" w:themeColor="text1"/>
         </w:rPr>
       </w:pPr>
+      <w:proofErr w:type="spellStart"/>
       <w:r>
         <w:rPr>
           <w:rFonts w:cs="Calibri"/>
@@ -45,6 +46,7 @@
         </w:rPr>
         <w:t>ZeroWaste</w:t>
       </w:r>
+      <w:proofErr w:type="spellEnd"/>
     </w:p>
     <w:p>
       <w:pPr>
@@ -293,6 +295,7 @@
                 <w:color w:val="000000" w:themeColor="text1"/>
               </w:rPr>
             </w:pPr>
+            <w:proofErr w:type="spellStart"/>
             <w:r>
               <w:rPr>
                 <w:rFonts w:cs="Calibri"/>
@@ -300,6 +303,7 @@
               </w:rPr>
               <w:t>ZeroWaste</w:t>
             </w:r>
+            <w:proofErr w:type="spellEnd"/>
           </w:p>
         </w:tc>
       </w:tr>
@@ -595,7 +599,23 @@
           <w:rFonts w:cs="Calibri"/>
           <w:color w:val="000000" w:themeColor="text1"/>
         </w:rPr>
-        <w:t>This document outlines the test strategy (what, when, and who) and the executable test cases (how) for all six use cases of the SavePlate Smart Food Waste Reduction App. It is aligned with the Iteration 1 assessment requirements.</w:t>
+        <w:t xml:space="preserve">This document outlines the test strategy (what, when, and who) and the executable test cases (how) for all six use cases of the </w:t>
+      </w:r>
+      <w:proofErr w:type="spellStart"/>
+      <w:r>
+        <w:rPr>
+          <w:rFonts w:cs="Calibri"/>
+          <w:color w:val="000000" w:themeColor="text1"/>
+        </w:rPr>
+        <w:t>SavePlate</w:t>
+      </w:r>
+      <w:proofErr w:type="spellEnd"/>
+      <w:r>
+        <w:rPr>
+          <w:rFonts w:cs="Calibri"/>
+          <w:color w:val="000000" w:themeColor="text1"/>
+        </w:rPr>
+        <w:t xml:space="preserve"> Smart Food Waste Reduction App. It is aligned with the Iteration 1 assessment requirements.</w:t>
       </w:r>
     </w:p>
     <w:p>
@@ -3433,7 +3453,7 @@
                 <w:rFonts w:cs="Calibri"/>
                 <w:color w:val="000000" w:themeColor="text1"/>
               </w:rPr>
-              <w:t>Student 1 (Unit Testing - Individual)</w:t>
+              <w:t>Kabir RajBhandari</w:t>
             </w:r>
           </w:p>
         </w:tc>
@@ -7161,10 +7181,9 @@
             </w:pPr>
             <w:r>
               <w:rPr>
-                <w:rFonts w:cs="Calibri"/>
-                <w:color w:val="000000" w:themeColor="text1"/>
-              </w:rPr>
-              <w:t>Student 2 (Unit Testing - Individual)</w:t>
+                <w:color w:val="000000" w:themeColor="text1"/>
+              </w:rPr>
+              <w:t>Sailesh Maharjan</w:t>
             </w:r>
           </w:p>
         </w:tc>
@@ -9985,7 +10004,23 @@
                 <w:rFonts w:cs="Calibri"/>
                 <w:color w:val="000000" w:themeColor="text1"/>
               </w:rPr>
-              <w:t>Item Name: Eggs Quantity: 'abc' Expiry: 2025-09-15 Category: Dairy</w:t>
+              <w:t>Item Name: Eggs Quantity: '</w:t>
+            </w:r>
+            <w:proofErr w:type="spellStart"/>
+            <w:r>
+              <w:rPr>
+                <w:rFonts w:cs="Calibri"/>
+                <w:color w:val="000000" w:themeColor="text1"/>
+              </w:rPr>
+              <w:t>abc</w:t>
+            </w:r>
+            <w:proofErr w:type="spellEnd"/>
+            <w:r>
+              <w:rPr>
+                <w:rFonts w:cs="Calibri"/>
+                <w:color w:val="000000" w:themeColor="text1"/>
+              </w:rPr>
+              <w:t>' Expiry: 2025-09-15 Category: Dairy</w:t>
             </w:r>
           </w:p>
         </w:tc>
@@ -10895,8 +10930,17 @@
                 <w:rFonts w:cs="Calibri"/>
                 <w:color w:val="000000" w:themeColor="text1"/>
               </w:rPr>
-              <w:t>Student 3 (Unit Testing - Individual)</w:t>
-            </w:r>
+              <w:t xml:space="preserve">Saksham Sharma </w:t>
+            </w:r>
+            <w:proofErr w:type="spellStart"/>
+            <w:r>
+              <w:rPr>
+                <w:rFonts w:cs="Calibri"/>
+                <w:color w:val="000000" w:themeColor="text1"/>
+              </w:rPr>
+              <w:t>Sedhai</w:t>
+            </w:r>
+            <w:proofErr w:type="spellEnd"/>
           </w:p>
         </w:tc>
       </w:tr>

</xml_diff>

<commit_message>
Loading error fix, and important pages added
</commit_message>
<xml_diff>
--- a/Report/Iteration_1/BIT216-Assignment2-Iteration-1(Test_plan_and_Documentation).docx
+++ b/Report/Iteration_1/BIT216-Assignment2-Iteration-1(Test_plan_and_Documentation).docx
@@ -34,7 +34,6 @@
           <w:color w:val="000000" w:themeColor="text1"/>
         </w:rPr>
       </w:pPr>
-      <w:proofErr w:type="spellStart"/>
       <w:r>
         <w:rPr>
           <w:rFonts w:cs="Calibri"/>
@@ -46,7 +45,6 @@
         </w:rPr>
         <w:t>ZeroWaste</w:t>
       </w:r>
-      <w:proofErr w:type="spellEnd"/>
     </w:p>
     <w:p>
       <w:pPr>
@@ -295,7 +293,6 @@
                 <w:color w:val="000000" w:themeColor="text1"/>
               </w:rPr>
             </w:pPr>
-            <w:proofErr w:type="spellStart"/>
             <w:r>
               <w:rPr>
                 <w:rFonts w:cs="Calibri"/>
@@ -303,7 +300,6 @@
               </w:rPr>
               <w:t>ZeroWaste</w:t>
             </w:r>
-            <w:proofErr w:type="spellEnd"/>
           </w:p>
         </w:tc>
       </w:tr>
@@ -599,23 +595,7 @@
           <w:rFonts w:cs="Calibri"/>
           <w:color w:val="000000" w:themeColor="text1"/>
         </w:rPr>
-        <w:t xml:space="preserve">This document outlines the test strategy (what, when, and who) and the executable test cases (how) for all six use cases of the </w:t>
-      </w:r>
-      <w:proofErr w:type="spellStart"/>
-      <w:r>
-        <w:rPr>
-          <w:rFonts w:cs="Calibri"/>
-          <w:color w:val="000000" w:themeColor="text1"/>
-        </w:rPr>
-        <w:t>SavePlate</w:t>
-      </w:r>
-      <w:proofErr w:type="spellEnd"/>
-      <w:r>
-        <w:rPr>
-          <w:rFonts w:cs="Calibri"/>
-          <w:color w:val="000000" w:themeColor="text1"/>
-        </w:rPr>
-        <w:t xml:space="preserve"> Smart Food Waste Reduction App. It is aligned with the Iteration 1 assessment requirements.</w:t>
+        <w:t>This document outlines the test strategy (what, when, and who) and the executable test cases (how) for all six use cases of the SavePlate Smart Food Waste Reduction App. It is aligned with the Iteration 1 assessment requirements.</w:t>
       </w:r>
     </w:p>
     <w:p>
@@ -10004,23 +9984,7 @@
                 <w:rFonts w:cs="Calibri"/>
                 <w:color w:val="000000" w:themeColor="text1"/>
               </w:rPr>
-              <w:t>Item Name: Eggs Quantity: '</w:t>
-            </w:r>
-            <w:proofErr w:type="spellStart"/>
-            <w:r>
-              <w:rPr>
-                <w:rFonts w:cs="Calibri"/>
-                <w:color w:val="000000" w:themeColor="text1"/>
-              </w:rPr>
-              <w:t>abc</w:t>
-            </w:r>
-            <w:proofErr w:type="spellEnd"/>
-            <w:r>
-              <w:rPr>
-                <w:rFonts w:cs="Calibri"/>
-                <w:color w:val="000000" w:themeColor="text1"/>
-              </w:rPr>
-              <w:t>' Expiry: 2025-09-15 Category: Dairy</w:t>
+              <w:t>Item Name: Eggs Quantity: 'abc' Expiry: 2025-09-15 Category: Dairy</w:t>
             </w:r>
           </w:p>
         </w:tc>
@@ -10860,7 +10824,14 @@
                 <w:rFonts w:cs="Calibri"/>
                 <w:color w:val="000000" w:themeColor="text1"/>
               </w:rPr>
-              <w:t>Iteration 1 - Sprint 2</w:t>
+              <w:t xml:space="preserve">Iteration 1 - Sprint </w:t>
+            </w:r>
+            <w:r>
+              <w:rPr>
+                <w:rFonts w:cs="Calibri"/>
+                <w:color w:val="000000" w:themeColor="text1"/>
+              </w:rPr>
+              <w:t>1</w:t>
             </w:r>
           </w:p>
         </w:tc>
@@ -10930,17 +10901,8 @@
                 <w:rFonts w:cs="Calibri"/>
                 <w:color w:val="000000" w:themeColor="text1"/>
               </w:rPr>
-              <w:t xml:space="preserve">Saksham Sharma </w:t>
-            </w:r>
-            <w:proofErr w:type="spellStart"/>
-            <w:r>
-              <w:rPr>
-                <w:rFonts w:cs="Calibri"/>
-                <w:color w:val="000000" w:themeColor="text1"/>
-              </w:rPr>
-              <w:t>Sedhai</w:t>
-            </w:r>
-            <w:proofErr w:type="spellEnd"/>
+              <w:t>Saksham Sharma Sedhai</w:t>
+            </w:r>
           </w:p>
         </w:tc>
       </w:tr>

</xml_diff>